<commit_message>
feat: mejoras en la seccion de redes sociales
</commit_message>
<xml_diff>
--- a/manual-admin-panel.docx
+++ b/manual-admin-panel.docx
@@ -70,7 +70,7 @@
           <w:color w:val="5A6A7A"/>
           <w:sz w:val="24"/>
         </w:rPr>
-        <w:t>Versión 1.0 — 01/08/2026</w:t>
+        <w:t>Versión 1.1 — 05/08/2026</w:t>
       </w:r>
     </w:p>
     <w:p>
@@ -143,7 +143,7 @@
           <w:b w:val="0"/>
           <w:i w:val="0"/>
         </w:rPr>
-        <w:t>El Panel de Administración del portal ONSV permite al equipo editor gestionar el contenido público del sitio: cifras, regiones, eventos, noticias, publicaciones, revistas, normas legales, analítica, datos abiertos, entornos viales, pie de página, popup y usuarios. Fue desarrollado como una aplicación web (React + TypeScript) montada sobre el mismo servidor Express del portal.</w:t>
+        <w:t>El Panel de Administración del portal ONSV permite al equipo editor gestionar el contenido público del sitio: cifras, banners, regiones, eventos, noticias, publicaciones, revistas, normas legales, analítica, datos abiertos, entornos viales, pie de página, popup y usuarios. Fue desarrollado como una aplicación web (React + TypeScript) montada sobre el mismo servidor Express del portal.</w:t>
       </w:r>
     </w:p>
     <w:p>
@@ -337,7 +337,7 @@
           <w:b w:val="0"/>
           <w:i w:val="0"/>
         </w:rPr>
-        <w:t>El panel se organiza en 13 módulos accesibles desde la barra lateral izquierda:</w:t>
+        <w:t>El panel se organiza en 14 módulos accesibles desde la barra lateral izquierda, de los cuales 3 son grupos desplegables (Comunicaciones, Publicaciones y Datos Abiertos):</w:t>
       </w:r>
     </w:p>
     <w:tbl>
@@ -1084,7 +1084,123 @@
         <w:pStyle w:val="Heading2"/>
       </w:pPr>
       <w:r>
-        <w:t>4.2 Misión y Visión</w:t>
+        <w:t>4.2 Banners</w:t>
+      </w:r>
+    </w:p>
+    <w:p>
+      <w:pPr/>
+      <w:r>
+        <w:t>Edita el carrusel principal de la página de inicio (bilingüe ES/EN). Cada slide se compone de kicker, título, párrafo, uno o dos botones e imagen.</w:t>
+      </w:r>
+    </w:p>
+    <w:p>
+      <w:pPr>
+        <w:pStyle w:val="ListBullet"/>
+      </w:pPr>
+      <w:r>
+        <w:t>Pestañas de idioma: ES (español) y EN (inglés).</w:t>
+      </w:r>
+    </w:p>
+    <w:p>
+      <w:pPr>
+        <w:pStyle w:val="ListBullet"/>
+      </w:pPr>
+      <w:r>
+        <w:t>Campos por slide: kicker, título, párrafo, botón 1 (texto + enlace) y, solo en el banner 1, botón 2 (texto + enlace).</w:t>
+      </w:r>
+    </w:p>
+    <w:p>
+      <w:pPr>
+        <w:pStyle w:val="ListBullet"/>
+      </w:pPr>
+      <w:r>
+        <w:t>Sintaxis de resaltado: escriba *palabra* dentro del título para mostrarla en color en el portal.</w:t>
+      </w:r>
+    </w:p>
+    <w:p>
+      <w:pPr>
+        <w:pStyle w:val="ListBullet"/>
+      </w:pPr>
+      <w:r>
+        <w:t>Reordenamiento: use las flechas arriba/abajo de cada slide para cambiar el orden; el cambio se guarda automáticamente.</w:t>
+      </w:r>
+    </w:p>
+    <w:p>
+      <w:pPr>
+        <w:pStyle w:val="ListBullet"/>
+      </w:pPr>
+      <w:r>
+        <w:t>Subida de imagen: pulse Subir para sustituir la imagen del slide.</w:t>
+      </w:r>
+    </w:p>
+    <w:p>
+      <w:pPr>
+        <w:pStyle w:val="ListBullet"/>
+      </w:pPr>
+      <w:r>
+        <w:t>Enlaces de botones: una URL externa (https://...) abre en pestaña nueva; una ruta interna (/publicaciones) o un ancla (#seccion) abre en la misma pestaña.</w:t>
+      </w:r>
+    </w:p>
+    <w:p>
+      <w:pPr>
+        <w:pStyle w:val="ListBullet"/>
+      </w:pPr>
+      <w:r>
+        <w:t>Conjunto fijo: los slides son prefijados; no se pueden crear ni eliminar, solo editar y reordenar.</w:t>
+      </w:r>
+    </w:p>
+    <w:p>
+      <w:pPr>
+        <w:pStyle w:val="ListNumber"/>
+      </w:pPr>
+      <w:r>
+        <w:t>Paso 1: Abra Banners y seleccione la pestaña de idioma (ES/EN).</w:t>
+      </w:r>
+    </w:p>
+    <w:p>
+      <w:pPr>
+        <w:pStyle w:val="ListNumber"/>
+      </w:pPr>
+      <w:r>
+        <w:t>Paso 2: Edite los textos (kicker, título, párrafo, botones) del slide que quiera modificar.</w:t>
+      </w:r>
+    </w:p>
+    <w:p>
+      <w:pPr>
+        <w:pStyle w:val="ListNumber"/>
+      </w:pPr>
+      <w:r>
+        <w:t>Paso 3: Si necesita cambiar el orden, use las flechas arriba/abajo del slide.</w:t>
+      </w:r>
+    </w:p>
+    <w:p>
+      <w:pPr>
+        <w:pStyle w:val="ListNumber"/>
+      </w:pPr>
+      <w:r>
+        <w:t>Paso 4: Pulse Guardar textos en el slide editado.</w:t>
+      </w:r>
+    </w:p>
+    <w:p>
+      <w:pPr>
+        <w:pStyle w:val="ListNumber"/>
+      </w:pPr>
+      <w:r>
+        <w:t>Paso 5: Verifique el resultado en la página de inicio del portal.</w:t>
+      </w:r>
+    </w:p>
+    <w:p>
+      <w:pPr/>
+      <w:r>
+        <w:t>[Captura de pantalla: Editor de Banners]</w:t>
+      </w:r>
+    </w:p>
+    <w:p>
+      <w:pPr>
+        <w:pStyle w:val="Heading2"/>
+      </w:pPr>
+      <w:r>
+        <w:t>4.3 Misión y Visión</w:t>
       </w:r>
     </w:p>
     <w:p>
@@ -1194,7 +1310,7 @@
         <w:pStyle w:val="Heading2"/>
       </w:pPr>
       <w:r>
-        <w:t>4.3 Cifras</w:t>
+        <w:t>4.4 Cifras</w:t>
       </w:r>
     </w:p>
     <w:p>
@@ -1294,7 +1410,7 @@
         <w:pStyle w:val="Heading2"/>
       </w:pPr>
       <w:r>
-        <w:t>4.4 Regiones</w:t>
+        <w:t>4.5 Regiones</w:t>
       </w:r>
     </w:p>
     <w:p>
@@ -1416,7 +1532,7 @@
         <w:pStyle w:val="Heading2"/>
       </w:pPr>
       <w:r>
-        <w:t>4.5 Comunicaciones — Eventos</w:t>
+        <w:t>4.6 Comunicaciones — Eventos</w:t>
       </w:r>
     </w:p>
     <w:p>
@@ -1568,7 +1684,7 @@
         <w:pStyle w:val="Heading2"/>
       </w:pPr>
       <w:r>
-        <w:t>4.6 Noticias, Notas de Prensa, Publicaciones y Normas Legales</w:t>
+        <w:t>4.7 Noticias, Notas de Prensa, Contenidos y Normas Legales</w:t>
       </w:r>
     </w:p>
     <w:p>
@@ -1577,7 +1693,7 @@
           <w:b w:val="0"/>
           <w:i w:val="0"/>
         </w:rPr>
-        <w:t>Estos cuatro módulos muestran los posts publicados en Ghost CMS y permiten habilitarlos o deshabilitarlos en el portal.</w:t>
+        <w:t>Estos cuatro módulos muestran los posts publicados en Ghost CMS y permiten habilitarlos o deshabilitarlos en el portal. Todos comparten el mismo componente de listado Paginado (10 por página) con un toggle por publicación. Sus rutas padres son: Noticias y Notas de prensa debajo de Comunicaciones; Contenidos dentro de Publicaciones; Normas Legales como módulo propio.</w:t>
       </w:r>
     </w:p>
     <w:p>
@@ -1620,6 +1736,62 @@
       </w:r>
       <w:r>
         <w:t>toggle habilitar/deshabilitar. Lo deshabilitado desaparece del portal público (noticias, búsquedas, detalle, listados).</w:t>
+      </w:r>
+    </w:p>
+    <w:p>
+      <w:pPr>
+        <w:pStyle w:val="Heading3"/>
+      </w:pPr>
+      <w:r>
+        <w:t>4.7a Noticias</w:t>
+      </w:r>
+    </w:p>
+    <w:p>
+      <w:pPr/>
+      <w:r>
+        <w:t>Comunicaciones -&gt; Noticias (/comunicaciones-noticias). Tipo Ghost: noticias.</w:t>
+      </w:r>
+    </w:p>
+    <w:p>
+      <w:pPr>
+        <w:pStyle w:val="Heading3"/>
+      </w:pPr>
+      <w:r>
+        <w:t>4.7b Notas de Prensa</w:t>
+      </w:r>
+    </w:p>
+    <w:p>
+      <w:pPr/>
+      <w:r>
+        <w:t>Comunicaciones -&gt; Notas de prensa (/comunicaciones-notas-prensa). Tipo Ghost: notas-de-prensa.</w:t>
+      </w:r>
+    </w:p>
+    <w:p>
+      <w:pPr>
+        <w:pStyle w:val="Heading3"/>
+      </w:pPr>
+      <w:r>
+        <w:t>4.7c Contenidos</w:t>
+      </w:r>
+    </w:p>
+    <w:p>
+      <w:pPr/>
+      <w:r>
+        <w:t>Publicaciones -&gt; Contenidos (/publicaciones-contenidos). Tipo Ghost: publicaciones.</w:t>
+      </w:r>
+    </w:p>
+    <w:p>
+      <w:pPr>
+        <w:pStyle w:val="Heading3"/>
+      </w:pPr>
+      <w:r>
+        <w:t>4.7d Normas Legales</w:t>
+      </w:r>
+    </w:p>
+    <w:p>
+      <w:pPr/>
+      <w:r>
+        <w:t>Normas Legales (/normas-legales). Tipo Ghost: normas-legales.</w:t>
       </w:r>
     </w:p>
     <w:p>
@@ -1692,7 +1864,7 @@
         <w:pStyle w:val="Heading2"/>
       </w:pPr>
       <w:r>
-        <w:t>4.7 Publicaciones — Revistas y Temas</w:t>
+        <w:t>4.8 Publicaciones — Revistas y Tipos</w:t>
       </w:r>
     </w:p>
     <w:p>
@@ -1802,7 +1974,7 @@
         <w:pStyle w:val="Heading2"/>
       </w:pPr>
       <w:r>
-        <w:t>4.8 Analítica — Menú y Submenú</w:t>
+        <w:t>4.9 Analítica — Menú y Submenú</w:t>
       </w:r>
     </w:p>
     <w:p>
@@ -1912,7 +2084,7 @@
         <w:pStyle w:val="Heading2"/>
       </w:pPr>
       <w:r>
-        <w:t>4.9 Popup</w:t>
+        <w:t>4.10 Popup</w:t>
       </w:r>
     </w:p>
     <w:p>
@@ -2012,7 +2184,7 @@
         <w:pStyle w:val="Heading2"/>
       </w:pPr>
       <w:r>
-        <w:t>4.10 Datos Abiertos, Categorías y Tipos</w:t>
+        <w:t>4.11 Datos Abiertos, Categorías y Tipos</w:t>
       </w:r>
     </w:p>
     <w:p>
@@ -2178,16 +2350,17 @@
         <w:pStyle w:val="Heading2"/>
       </w:pPr>
       <w:r>
-        <w:t>4.11 Programas — Entornos Viales</w:t>
+        <w:t>4.12 Programas</w:t>
       </w:r>
     </w:p>
     <w:p>
+      <w:pPr/>
       <w:r>
         <w:rPr>
           <w:b w:val="0"/>
           <w:i w:val="0"/>
         </w:rPr>
-        <w:t>Administra las tarjetas de la campaña de entornos viales (página pública bilingüe).</w:t>
+        <w:t>Administra los programas institucionales de la ONSV.</w:t>
       </w:r>
     </w:p>
     <w:p>
@@ -2195,7 +2368,7 @@
         <w:pStyle w:val="ListBullet"/>
       </w:pPr>
       <w:r>
-        <w:t>Campos: badge, título, descripción (ES/EN), imagen, orden de visualización y estado activo.</w:t>
+        <w:t>Listado Paginado (5 por página) con chip de «N activos».</w:t>
       </w:r>
     </w:p>
     <w:p>
@@ -2203,36 +2376,32 @@
         <w:pStyle w:val="ListBullet"/>
       </w:pPr>
       <w:r>
-        <w:t>La página pública puede mostrar carrusel o grid según la configuración.</w:t>
+        <w:t>Campos: código (autogenerado por slug si se deja vacío), nombre (obligatorio) y descripción.</w:t>
       </w:r>
     </w:p>
     <w:p>
       <w:pPr>
-        <w:pStyle w:val="ListNumber"/>
+        <w:pStyle w:val="ListBullet"/>
       </w:pPr>
       <w:r>
         <w:rPr>
           <w:b/>
         </w:rPr>
-        <w:t xml:space="preserve">Paso 1: </w:t>
+        <w:t>Estado activo/inactivo: controla la visibilidad pública del programa.</w:t>
       </w:r>
-      <w:r>
-        <w:t>Abra Programas, pulse Agregar y complete badge, título y descripciones.</w:t>
-      </w:r>
+      <w:r/>
     </w:p>
     <w:p>
       <w:pPr>
-        <w:pStyle w:val="ListNumber"/>
+        <w:pStyle w:val="ListBullet"/>
       </w:pPr>
       <w:r>
         <w:rPr>
           <w:b/>
         </w:rPr>
-        <w:t xml:space="preserve">Paso 2: </w:t>
+        <w:t>Acciones: crear (modal), editar y eliminar (con confirmación).</w:t>
       </w:r>
-      <w:r>
-        <w:t>Suba la imagen y asigne el orden.</w:t>
-      </w:r>
+      <w:r/>
     </w:p>
     <w:p>
       <w:pPr>
@@ -2242,27 +2411,50 @@
         <w:rPr>
           <w:b/>
         </w:rPr>
-        <w:t xml:space="preserve">Paso 3: </w:t>
+        <w:t>Paso 1: Abra Programas y pulse «Agregar».</w:t>
       </w:r>
-      <w:r>
-        <w:t>Guarde y active; revise el resultado en /entornos-viales.</w:t>
-      </w:r>
+      <w:r/>
     </w:p>
     <w:p>
+      <w:pPr>
+        <w:pStyle w:val="ListNumber"/>
+      </w:pPr>
       <w:r>
         <w:rPr>
           <w:i/>
           <w:color w:val="5A6A7A"/>
         </w:rPr>
-        <w:t>[Captura de pantalla: Gestión de entornos viales]</w:t>
+        <w:t>Paso 2: Complete el nombre (obligatorio) y la descripción.</w:t>
       </w:r>
     </w:p>
     <w:p>
       <w:pPr>
+        <w:pStyle w:val="ListNumber"/>
+      </w:pPr>
+      <w:r>
+        <w:t>Paso 3: (Opcional) Escriba un código personalizado o déjelo vacío para que se autogenere.</w:t>
+      </w:r>
+    </w:p>
+    <w:p>
+      <w:pPr>
+        <w:pStyle w:val="ListNumber"/>
+      </w:pPr>
+      <w:r>
+        <w:t>Paso 4: Guarde y, si quiere que sea visible, marque el estado activo.</w:t>
+      </w:r>
+    </w:p>
+    <w:p>
+      <w:pPr/>
+      <w:r>
+        <w:t>[Captura de pantalla: Gestión de Programas]</w:t>
+      </w:r>
+    </w:p>
+    <w:p>
+      <w:pPr>
         <w:pStyle w:val="Heading2"/>
       </w:pPr>
       <w:r>
-        <w:t>4.12 Pie de Página — Información y Redes Sociales</w:t>
+        <w:t>4.13 Pie de Página — Información y Redes Sociales</w:t>
       </w:r>
     </w:p>
     <w:p>
@@ -2358,7 +2550,7 @@
         <w:pStyle w:val="Heading2"/>
       </w:pPr>
       <w:r>
-        <w:t>4.13 Usuarios y Roles</w:t>
+        <w:t>4.14 Usuarios y Roles</w:t>
       </w:r>
     </w:p>
     <w:p>

</xml_diff>

<commit_message>
feat: mejoras en responsivo
</commit_message>
<xml_diff>
--- a/manual-admin-panel.docx
+++ b/manual-admin-panel.docx
@@ -337,7 +337,223 @@
           <w:b w:val="0"/>
           <w:i w:val="0"/>
         </w:rPr>
-        <w:t>El panel se organiza en 14 módulos accesibles desde la barra lateral izquierda, de los cuales 3 son grupos desplegables (Comunicaciones, Publicaciones y Datos Abiertos):</w:t>
+        <w:t>El panel se organiza en 14 módulos accesibles desde la barra lateral izquierda, de los cuales 4 son grupos desplegables (Comunicaciones, Publicaciones, Analítica y Datos Abiertos):</w:t>
+      </w:r>
+    </w:p>
+    <w:p>
+      <w:pPr>
+        <w:pStyle w:val="ListBullet"/>
+        <w:ind w:left="0"/>
+      </w:pPr>
+      <w:r>
+        <w:t>Inicio (Dashboard)</w:t>
+      </w:r>
+    </w:p>
+    <w:p>
+      <w:pPr>
+        <w:pStyle w:val="ListBullet"/>
+        <w:ind w:left="0"/>
+      </w:pPr>
+      <w:r>
+        <w:t>Banners</w:t>
+      </w:r>
+    </w:p>
+    <w:p>
+      <w:pPr>
+        <w:pStyle w:val="ListBullet"/>
+        <w:ind w:left="0"/>
+      </w:pPr>
+      <w:r>
+        <w:t>Misión — Visión</w:t>
+      </w:r>
+    </w:p>
+    <w:p>
+      <w:pPr>
+        <w:pStyle w:val="ListBullet"/>
+        <w:ind w:left="0"/>
+      </w:pPr>
+      <w:r>
+        <w:t>Cifras</w:t>
+      </w:r>
+    </w:p>
+    <w:p>
+      <w:pPr>
+        <w:pStyle w:val="ListBullet"/>
+        <w:ind w:left="0"/>
+      </w:pPr>
+      <w:r>
+        <w:t>Regiones</w:t>
+      </w:r>
+    </w:p>
+    <w:p>
+      <w:pPr>
+        <w:pStyle w:val="ListBullet"/>
+        <w:ind w:left="0"/>
+      </w:pPr>
+      <w:r>
+        <w:t>Comunicaciones</w:t>
+      </w:r>
+    </w:p>
+    <w:p>
+      <w:pPr>
+        <w:pStyle w:val="ListBullet"/>
+        <w:ind w:left="709"/>
+      </w:pPr>
+      <w:r>
+        <w:t>Noticias</w:t>
+      </w:r>
+    </w:p>
+    <w:p>
+      <w:pPr>
+        <w:pStyle w:val="ListBullet"/>
+        <w:ind w:left="709"/>
+      </w:pPr>
+      <w:r>
+        <w:t>Notas de prensa</w:t>
+      </w:r>
+    </w:p>
+    <w:p>
+      <w:pPr>
+        <w:pStyle w:val="ListBullet"/>
+        <w:ind w:left="709"/>
+      </w:pPr>
+      <w:r>
+        <w:t>Eventos</w:t>
+      </w:r>
+    </w:p>
+    <w:p>
+      <w:pPr>
+        <w:pStyle w:val="ListBullet"/>
+        <w:ind w:left="0"/>
+      </w:pPr>
+      <w:r>
+        <w:t>Publicaciones</w:t>
+      </w:r>
+    </w:p>
+    <w:p>
+      <w:pPr>
+        <w:pStyle w:val="ListBullet"/>
+        <w:ind w:left="709"/>
+      </w:pPr>
+      <w:r>
+        <w:t>Contenidos</w:t>
+      </w:r>
+    </w:p>
+    <w:p>
+      <w:pPr>
+        <w:pStyle w:val="ListBullet"/>
+        <w:ind w:left="709"/>
+      </w:pPr>
+      <w:r>
+        <w:t>Revistas</w:t>
+      </w:r>
+    </w:p>
+    <w:p>
+      <w:pPr>
+        <w:pStyle w:val="ListBullet"/>
+        <w:ind w:left="0"/>
+      </w:pPr>
+      <w:r>
+        <w:t>Normas Legales</w:t>
+      </w:r>
+    </w:p>
+    <w:p>
+      <w:pPr>
+        <w:pStyle w:val="ListBullet"/>
+        <w:ind w:left="0"/>
+      </w:pPr>
+      <w:r>
+        <w:t>Analítica</w:t>
+      </w:r>
+    </w:p>
+    <w:p>
+      <w:pPr>
+        <w:pStyle w:val="ListBullet"/>
+        <w:ind w:left="709"/>
+      </w:pPr>
+      <w:r>
+        <w:t>Menú</w:t>
+      </w:r>
+    </w:p>
+    <w:p>
+      <w:pPr>
+        <w:pStyle w:val="ListBullet"/>
+        <w:ind w:left="709"/>
+      </w:pPr>
+      <w:r>
+        <w:t>Submenú</w:t>
+      </w:r>
+    </w:p>
+    <w:p>
+      <w:pPr>
+        <w:pStyle w:val="ListBullet"/>
+        <w:ind w:left="0"/>
+      </w:pPr>
+      <w:r>
+        <w:t>Popup</w:t>
+      </w:r>
+    </w:p>
+    <w:p>
+      <w:pPr>
+        <w:pStyle w:val="ListBullet"/>
+        <w:ind w:left="0"/>
+      </w:pPr>
+      <w:r>
+        <w:t>Datos Abiertos</w:t>
+      </w:r>
+    </w:p>
+    <w:p>
+      <w:pPr>
+        <w:pStyle w:val="ListBullet"/>
+        <w:ind w:left="709"/>
+      </w:pPr>
+      <w:r>
+        <w:t>Datos</w:t>
+      </w:r>
+    </w:p>
+    <w:p>
+      <w:pPr>
+        <w:pStyle w:val="ListBullet"/>
+        <w:ind w:left="709"/>
+      </w:pPr>
+      <w:r>
+        <w:t>Categorías</w:t>
+      </w:r>
+    </w:p>
+    <w:p>
+      <w:pPr>
+        <w:pStyle w:val="ListBullet"/>
+        <w:ind w:left="709"/>
+      </w:pPr>
+      <w:r>
+        <w:t>Tipos</w:t>
+      </w:r>
+    </w:p>
+    <w:p>
+      <w:pPr>
+        <w:pStyle w:val="ListBullet"/>
+        <w:ind w:left="0"/>
+      </w:pPr>
+      <w:r>
+        <w:t>Programas</w:t>
+      </w:r>
+    </w:p>
+    <w:p>
+      <w:pPr>
+        <w:pStyle w:val="ListBullet"/>
+        <w:ind w:left="0"/>
+      </w:pPr>
+      <w:r>
+        <w:t>Pie de página</w:t>
+      </w:r>
+    </w:p>
+    <w:p>
+      <w:pPr>
+        <w:pStyle w:val="ListBullet"/>
+        <w:ind w:left="0"/>
+      </w:pPr>
+      <w:r>
+        <w:t>Usuarios</w:t>
       </w:r>
     </w:p>
     <w:tbl>
@@ -455,12 +671,60 @@
             <w:tcW w:type="dxa" w:w="576"/>
           </w:tcPr>
           <w:p>
-            <w:r/>
+            <w:r>
+              <w:t>2</w:t>
+            </w:r>
             <w:r>
               <w:rPr>
                 <w:sz w:val="20"/>
               </w:rPr>
-              <w:t>2</w:t>
+            </w:r>
+          </w:p>
+        </w:tc>
+        <w:tc>
+          <w:tcPr>
+            <w:tcW w:type="dxa" w:w="2736"/>
+          </w:tcPr>
+          <w:p>
+            <w:r>
+              <w:t>Banners</w:t>
+            </w:r>
+            <w:r>
+              <w:rPr>
+                <w:sz w:val="20"/>
+              </w:rPr>
+            </w:r>
+          </w:p>
+        </w:tc>
+        <w:tc>
+          <w:tcPr>
+            <w:tcW w:type="dxa" w:w="5328"/>
+          </w:tcPr>
+          <w:p>
+            <w:r>
+              <w:t>Carrusel bilingüe de la página de inicio (kicker, título, párrafo, botones e imagen)</w:t>
+            </w:r>
+            <w:r>
+              <w:rPr>
+                <w:sz w:val="20"/>
+              </w:rPr>
+            </w:r>
+          </w:p>
+        </w:tc>
+      </w:tr>
+      <w:tr>
+        <w:tc>
+          <w:tcPr>
+            <w:tcW w:type="dxa" w:w="576"/>
+          </w:tcPr>
+          <w:p>
+            <w:r>
+              <w:t>3</w:t>
+            </w:r>
+            <w:r>
+              <w:rPr>
+                <w:sz w:val="20"/>
+              </w:rPr>
             </w:r>
           </w:p>
         </w:tc>
@@ -499,12 +763,13 @@
             <w:tcW w:type="dxa" w:w="576"/>
           </w:tcPr>
           <w:p>
-            <w:r/>
+            <w:r>
+              <w:t>4</w:t>
+            </w:r>
             <w:r>
               <w:rPr>
                 <w:sz w:val="20"/>
               </w:rPr>
-              <w:t>3</w:t>
             </w:r>
           </w:p>
         </w:tc>
@@ -543,12 +808,13 @@
             <w:tcW w:type="dxa" w:w="576"/>
           </w:tcPr>
           <w:p>
-            <w:r/>
+            <w:r>
+              <w:t>5</w:t>
+            </w:r>
             <w:r>
               <w:rPr>
                 <w:sz w:val="20"/>
               </w:rPr>
-              <w:t>4</w:t>
             </w:r>
           </w:p>
         </w:tc>
@@ -587,12 +853,13 @@
             <w:tcW w:type="dxa" w:w="576"/>
           </w:tcPr>
           <w:p>
-            <w:r/>
+            <w:r>
+              <w:t>6</w:t>
+            </w:r>
             <w:r>
               <w:rPr>
                 <w:sz w:val="20"/>
               </w:rPr>
-              <w:t>5</w:t>
             </w:r>
           </w:p>
         </w:tc>
@@ -631,12 +898,13 @@
             <w:tcW w:type="dxa" w:w="576"/>
           </w:tcPr>
           <w:p>
-            <w:r/>
+            <w:r>
+              <w:t>7</w:t>
+            </w:r>
             <w:r>
               <w:rPr>
                 <w:sz w:val="20"/>
               </w:rPr>
-              <w:t>6</w:t>
             </w:r>
           </w:p>
         </w:tc>
@@ -659,12 +927,13 @@
             <w:tcW w:type="dxa" w:w="5328"/>
           </w:tcPr>
           <w:p>
-            <w:r/>
+            <w:r>
+              <w:t>Contenidos (posts), revistas y tipos</w:t>
+            </w:r>
             <w:r>
               <w:rPr>
                 <w:sz w:val="20"/>
               </w:rPr>
-              <w:t>Contenidos (posts), revistas y temas</w:t>
             </w:r>
           </w:p>
         </w:tc>
@@ -675,12 +944,13 @@
             <w:tcW w:type="dxa" w:w="576"/>
           </w:tcPr>
           <w:p>
-            <w:r/>
+            <w:r>
+              <w:t>8</w:t>
+            </w:r>
             <w:r>
               <w:rPr>
                 <w:sz w:val="20"/>
               </w:rPr>
-              <w:t>7</w:t>
             </w:r>
           </w:p>
         </w:tc>
@@ -719,12 +989,13 @@
             <w:tcW w:type="dxa" w:w="576"/>
           </w:tcPr>
           <w:p>
-            <w:r/>
+            <w:r>
+              <w:t>9</w:t>
+            </w:r>
             <w:r>
               <w:rPr>
                 <w:sz w:val="20"/>
               </w:rPr>
-              <w:t>8</w:t>
             </w:r>
           </w:p>
         </w:tc>
@@ -763,12 +1034,13 @@
             <w:tcW w:type="dxa" w:w="576"/>
           </w:tcPr>
           <w:p>
-            <w:r/>
+            <w:r>
+              <w:t>10</w:t>
+            </w:r>
             <w:r>
               <w:rPr>
                 <w:sz w:val="20"/>
               </w:rPr>
-              <w:t>9</w:t>
             </w:r>
           </w:p>
         </w:tc>
@@ -807,12 +1079,13 @@
             <w:tcW w:type="dxa" w:w="576"/>
           </w:tcPr>
           <w:p>
-            <w:r/>
+            <w:r>
+              <w:t>11</w:t>
+            </w:r>
             <w:r>
               <w:rPr>
                 <w:sz w:val="20"/>
               </w:rPr>
-              <w:t>10</w:t>
             </w:r>
           </w:p>
         </w:tc>
@@ -851,12 +1124,13 @@
             <w:tcW w:type="dxa" w:w="576"/>
           </w:tcPr>
           <w:p>
-            <w:r/>
+            <w:r>
+              <w:t>12</w:t>
+            </w:r>
             <w:r>
               <w:rPr>
                 <w:sz w:val="20"/>
               </w:rPr>
-              <w:t>11</w:t>
             </w:r>
           </w:p>
         </w:tc>
@@ -879,12 +1153,13 @@
             <w:tcW w:type="dxa" w:w="5328"/>
           </w:tcPr>
           <w:p>
-            <w:r/>
+            <w:r>
+              <w:t>Programas institucionales (código, nombre, descripción, activo)</w:t>
+            </w:r>
             <w:r>
               <w:rPr>
                 <w:sz w:val="20"/>
               </w:rPr>
-              <w:t>Tarjetas de entornos viales</w:t>
             </w:r>
           </w:p>
         </w:tc>
@@ -895,12 +1170,13 @@
             <w:tcW w:type="dxa" w:w="576"/>
           </w:tcPr>
           <w:p>
-            <w:r/>
+            <w:r>
+              <w:t>13</w:t>
+            </w:r>
             <w:r>
               <w:rPr>
                 <w:sz w:val="20"/>
               </w:rPr>
-              <w:t>12</w:t>
             </w:r>
           </w:p>
         </w:tc>
@@ -939,12 +1215,13 @@
             <w:tcW w:type="dxa" w:w="576"/>
           </w:tcPr>
           <w:p>
-            <w:r/>
+            <w:r>
+              <w:t>14</w:t>
+            </w:r>
             <w:r>
               <w:rPr>
                 <w:sz w:val="20"/>
               </w:rPr>
-              <w:t>13</w:t>
             </w:r>
           </w:p>
         </w:tc>
@@ -978,7 +1255,6 @@
         </w:tc>
       </w:tr>
     </w:tbl>
-    <w:p/>
     <w:p>
       <w:pPr>
         <w:pStyle w:val="Heading2"/>

</xml_diff>